<commit_message>
docs: finalize competition proposal report, upgraded high-end PPT, screen-recording storyboard, and registration form
</commit_message>
<xml_diff>
--- a/docs/competition/银发导航智能体：基于多Agent协同的老年人安心出行伴侣.docx
+++ b/docs/competition/银发导航智能体：基于多Agent协同的老年人安心出行伴侣.docx
@@ -14,7 +14,7 @@
           <w:color w:val="1F4E79"/>
           <w:sz w:val="40"/>
         </w:rPr>
-        <w:t>第八届湖南省大学生智能导航科技创新大赛（科技创意类）</w:t>
+        <w:t>银发导航智能体：基于多Agent协同的老年人安心出行伴侣</w:t>
       </w:r>
     </w:p>
     <w:p>
@@ -29,7 +29,7 @@
           <w:color w:val="1F4E79"/>
           <w:sz w:val="40"/>
         </w:rPr>
-        <w:t>参赛作品申报书与技术创新论证方案</w:t>
+        <w:t>系统架构设计与技术实施方案报告</w:t>
       </w:r>
     </w:p>
     <w:p>
@@ -76,13 +76,11 @@
               </w:rPr>
               <w:t>项目名称：银发导航智能体：基于多Agent协同的老年人安心出行伴侣</w:t>
               <w:br/>
-              <w:t>参赛赛道：科技创意类赛道</w:t>
+              <w:t>核心定位：基于中国北斗高精度时空感知与多Agent协同的老年人全场景安心出行护航系统</w:t>
               <w:br/>
-              <w:t>主办单位：湖南省教育厅</w:t>
+              <w:t>技术架构：微内核全序事件总线 + 5大领域智能体协同调度 + 适老微地形代价路由模型</w:t>
               <w:br/>
-              <w:t>承办单位：国防科技大学、测控与导航技术国家地方联合工程研究中心、湘南学院</w:t>
-              <w:br/>
-              <w:t>申报日期：2026年9月</w:t>
+              <w:t>完成日期：2026年9月</w:t>
             </w:r>
           </w:p>
         </w:tc>
@@ -595,20 +593,7 @@
         <w:rPr>
           <w:rFonts w:ascii="SimSun" w:hAnsi="SimSun" w:eastAsia="SimSun"/>
         </w:rPr>
-        <w:t>在此时代背景下，</w:t>
-      </w:r>
-      <w:r>
-        <w:rPr>
-          <w:rFonts w:ascii="SimSun" w:hAnsi="SimSun" w:eastAsia="SimSun"/>
-          <w:b/>
-        </w:rPr>
-        <w:t>第八届湖南省大学生智能导航科技创新大赛</w:t>
-      </w:r>
-      <w:r>
-        <w:rPr>
-          <w:rFonts w:ascii="SimSun" w:hAnsi="SimSun" w:eastAsia="SimSun"/>
-        </w:rPr>
-        <w:t>（科技创意类赛道）聚焦北斗高精度时空信息的民生赋能与技术融合。本项目《银发导航智能体：基于多Agent协同的老年人安心出行伴侣》，正是顺应“北斗规模化应用”与“国家积极应对人口老龄化”两大国家战略历史交汇点的创新实践。</w:t>
+        <w:t>在此时代背景下，聚焦北斗高精度时空信息的民生赋能与多Agent智能技术融合显得尤为迫切。本项目《银发导航智能体：基于多Agent协同的老年人安心出行伴侣》，正是顺应“北斗规模化应用”与“国家积极应对人口老龄化”两大国家战略历史交汇点的创新技术实践与系统工程。</w:t>
       </w:r>
     </w:p>
     <w:p>
@@ -4236,7 +4221,7 @@
         <w:rPr>
           <w:rFonts w:ascii="SimSun" w:hAnsi="SimSun" w:eastAsia="SimSun"/>
         </w:rPr>
-        <w:t>作为由湖南省教育厅主办、国防科技大学等牵头承办的权威赛事参赛作品，本项目充分依托湖南省在北斗导航领域的雄厚科研底蕴（国防科大北斗科研国家队、国家测控工程中心及株洲北斗产业园）：</w:t>
+        <w:t>本项目充分依托湖南省在北斗导航与智能计算领域的雄厚科研底蕴与产业集群优势：</w:t>
       </w:r>
     </w:p>
     <w:p>
@@ -4248,7 +4233,7 @@
         <w:rPr>
           <w:rFonts w:ascii="SimSun" w:hAnsi="SimSun" w:eastAsia="SimSun"/>
         </w:rPr>
-        <w:t>实现了高校前沿科研成果与本地智慧康养民生需求的无缝衔接；</w:t>
+        <w:t>实现了人工智能与卫星导航前沿成果与本地智慧康养民生需求的无缝衔接；</w:t>
       </w:r>
     </w:p>
     <w:p>
@@ -4260,7 +4245,7 @@
         <w:rPr>
           <w:rFonts w:ascii="SimSun" w:hAnsi="SimSun" w:eastAsia="SimSun"/>
         </w:rPr>
-        <w:t>以长沙市湘雅医院、省人民医院、烈士公园为典型样板，打造出一套具备完整自主知识产权、可全国复制推广的“北斗+AI适老示范标准”，为湖南打造国家级新一代自主安全计算系统产业集群与北斗产业高地贡献青年科技力量！</w:t>
+        <w:t>以长沙市湘雅医院、省人民医院、烈士公园为典型样板，打造出一套具备完整自主知识产权、可全国复制推广的“北斗+多Agent适老出行示范标准”，为构建新一代适老智慧城市与北斗产业规模化应用标杆提供坚实的技术支撑与实践范本！</w:t>
       </w:r>
     </w:p>
     <w:p>
@@ -4277,7 +4262,7 @@
         <w:rPr>
           <w:rFonts w:ascii="SimSun" w:hAnsi="SimSun" w:eastAsia="SimSun"/>
         </w:rPr>
-        <w:t>*(申报书完)*</w:t>
+        <w:t>*(方案报告完)*</w:t>
       </w:r>
     </w:p>
     <w:sectPr>

</xml_diff>

<commit_message>
feat(agent+map): revamp multi-agent cognitive swarm and 60fps smooth map navigation
</commit_message>
<xml_diff>
--- a/docs/competition/银发导航智能体：基于多Agent协同的老年人安心出行伴侣.docx
+++ b/docs/competition/银发导航智能体：基于多Agent协同的老年人安心出行伴侣.docx
@@ -415,7 +415,7 @@
         <w:rPr>
           <w:rFonts w:ascii="SimSun" w:hAnsi="SimSun" w:eastAsia="SimSun"/>
         </w:rPr>
-        <w:t>[商业落地路径与产业化前景](#6-商业落地路径与产业化前景)</w:t>
+        <w:t>[系统优化核心亮点与综合性能实测验证](#6-系统优化核心亮点与综合性能实测验证)</w:t>
       </w:r>
     </w:p>
     <w:p>
@@ -427,7 +427,7 @@
         <w:rPr>
           <w:rFonts w:ascii="SimSun" w:hAnsi="SimSun" w:eastAsia="SimSun"/>
         </w:rPr>
-        <w:t>6.1 B2C家庭安心守护订阅模式（孝心经济闭环）</w:t>
+        <w:t>6.1 与传统商业导航及通用LLM的横向能力全景对比</w:t>
       </w:r>
     </w:p>
     <w:p>
@@ -439,7 +439,7 @@
         <w:rPr>
           <w:rFonts w:ascii="SimSun" w:hAnsi="SimSun" w:eastAsia="SimSun"/>
         </w:rPr>
-        <w:t>6.2 B2B银发康养机构与智能硬件联合方案（手环、智能拐杖预装）</w:t>
+        <w:t>6.2 适老微地形代价路由算法优化亮点与路网实测</w:t>
       </w:r>
     </w:p>
     <w:p>
@@ -451,7 +451,7 @@
         <w:rPr>
           <w:rFonts w:ascii="SimSun" w:hAnsi="SimSun" w:eastAsia="SimSun"/>
         </w:rPr>
-        <w:t>6.3 B2G适老化公共服务改造与政府民政采购</w:t>
+        <w:t>6.3 密集遮蔽与弱信号环境下的北斗亚米级滤波抗扰优化</w:t>
       </w:r>
     </w:p>
     <w:p>
@@ -463,11 +463,23 @@
         <w:rPr>
           <w:rFonts w:ascii="SimSun" w:hAnsi="SimSun" w:eastAsia="SimSun"/>
         </w:rPr>
-        <w:t>6.4 商业可行性测算与财务模型</w:t>
+        <w:t>6.4 多Agent并发协同调度优化与端到端高可靠性验证</w:t>
       </w:r>
     </w:p>
     <w:p>
       <w:pPr>
+        <w:pStyle w:val="ListBullet"/>
+        <w:spacing w:after="60" w:line="300" w:lineRule="auto"/>
+      </w:pPr>
+      <w:r>
+        <w:rPr>
+          <w:rFonts w:ascii="SimSun" w:hAnsi="SimSun" w:eastAsia="SimSun"/>
+        </w:rPr>
+        <w:t>6.5 老年人交互可用性实测（SUS适老化工效评估）</w:t>
+      </w:r>
+    </w:p>
+    <w:p>
+      <w:pPr>
         <w:pStyle w:val="ListNumber"/>
         <w:spacing w:after="60" w:line="300" w:lineRule="auto"/>
       </w:pPr>
@@ -475,7 +487,7 @@
         <w:rPr>
           <w:rFonts w:ascii="SimSun" w:hAnsi="SimSun" w:eastAsia="SimSun"/>
         </w:rPr>
-        <w:t>[社会效益与北斗规模化应用战略价值](#7-社会效益与北斗规模化应用战略价值)</w:t>
+        <w:t>[科技创意特色与软硬件延伸应用方案](#7-科技创意特色与软硬件延伸应用方案)</w:t>
       </w:r>
     </w:p>
     <w:p>
@@ -487,7 +499,7 @@
         <w:rPr>
           <w:rFonts w:ascii="SimSun" w:hAnsi="SimSun" w:eastAsia="SimSun"/>
         </w:rPr>
-        <w:t>7.1 赋能健康老龄化国家战略，消除数字出行鸿沟</w:t>
+        <w:t>7.1 “北斗+AI”软硬一体化微型化创意拓展（智能助老拐杖与适老手环）</w:t>
       </w:r>
     </w:p>
     <w:p>
@@ -499,7 +511,7 @@
         <w:rPr>
           <w:rFonts w:ascii="SimSun" w:hAnsi="SimSun" w:eastAsia="SimSun"/>
         </w:rPr>
-        <w:t>7.2 推动北斗大众消费级终端与民生场景规模化落地</w:t>
+        <w:t>7.2 基于北斗三号短报文（RDSS）的无蜂窝盲区极限自救机制</w:t>
       </w:r>
     </w:p>
     <w:p>
@@ -511,7 +523,19 @@
         <w:rPr>
           <w:rFonts w:ascii="SimSun" w:hAnsi="SimSun" w:eastAsia="SimSun"/>
         </w:rPr>
-        <w:t>7.3 产学研深度融合与湖南本地智能信息产业升级赋能</w:t>
+        <w:t>7.3 空间生活地标知识图谱与湖南微地理适老底座</w:t>
+      </w:r>
+    </w:p>
+    <w:p>
+      <w:pPr>
+        <w:pStyle w:val="ListBullet"/>
+        <w:spacing w:after="60" w:line="300" w:lineRule="auto"/>
+      </w:pPr>
+      <w:r>
+        <w:rPr>
+          <w:rFonts w:ascii="SimSun" w:hAnsi="SimSun" w:eastAsia="SimSun"/>
+        </w:rPr>
+        <w:t>7.4 总结：硬核科技与民生情怀的高度契合</w:t>
       </w:r>
     </w:p>
     <w:p>
@@ -3531,11 +3555,25 @@
           <w:color w:val="1F4E79"/>
           <w:sz w:val="30"/>
         </w:rPr>
-        <w:t>6. 商业落地路径与产业化前景</w:t>
+        <w:t>6. 系统优化核心亮点与综合性能实测验证</w:t>
       </w:r>
     </w:p>
     <w:p>
       <w:pPr>
+        <w:spacing w:before="200" w:after="80"/>
+      </w:pPr>
+      <w:r>
+        <w:rPr>
+          <w:rFonts w:ascii="SimHei" w:hAnsi="SimHei" w:eastAsia="SimHei"/>
+          <w:b/>
+          <w:color w:val="2E75B6"/>
+          <w:sz w:val="25"/>
+        </w:rPr>
+        <w:t>6.1 与传统商业导航及通用大模型的横向能力全景对比</w:t>
+      </w:r>
+    </w:p>
+    <w:p>
+      <w:pPr>
         <w:spacing w:after="80" w:line="300" w:lineRule="auto"/>
         <w:ind w:firstLine="403"/>
       </w:pPr>
@@ -3543,20 +3581,33 @@
         <w:rPr>
           <w:rFonts w:ascii="SimSun" w:hAnsi="SimSun" w:eastAsia="SimSun"/>
         </w:rPr>
-        <w:t xml:space="preserve">本项目秉承“技术过硬、商业自洽、社会受益”的产业化理念，构建起 </w:t>
+        <w:t>为了直观展现本项目的核心优化与技术护城河，团队选取市场上最主流的两类产品形态——</w:t>
       </w:r>
       <w:r>
         <w:rPr>
           <w:rFonts w:ascii="SimSun" w:hAnsi="SimSun" w:eastAsia="SimSun"/>
           <w:b/>
         </w:rPr>
-        <w:t>B2C 孝心订阅 + B2B 康养赋能 + B2G 民政采购</w:t>
-      </w:r>
-      <w:r>
-        <w:rPr>
-          <w:rFonts w:ascii="SimSun" w:hAnsi="SimSun" w:eastAsia="SimSun"/>
-        </w:rPr>
-        <w:t xml:space="preserve"> 三位一体的商业闭环模型：</w:t>
+        <w:t>传统车载/民用地图（以高德/百度步行模式为代表）</w:t>
+      </w:r>
+      <w:r>
+        <w:rPr>
+          <w:rFonts w:ascii="SimSun" w:hAnsi="SimSun" w:eastAsia="SimSun"/>
+        </w:rPr>
+        <w:t>与</w:t>
+      </w:r>
+      <w:r>
+        <w:rPr>
+          <w:rFonts w:ascii="SimSun" w:hAnsi="SimSun" w:eastAsia="SimSun"/>
+          <w:b/>
+        </w:rPr>
+        <w:t>通用大模型会话助手（以通用LLM为代表）</w:t>
+      </w:r>
+      <w:r>
+        <w:rPr>
+          <w:rFonts w:ascii="SimSun" w:hAnsi="SimSun" w:eastAsia="SimSun"/>
+        </w:rPr>
+        <w:t>，与本作品进行7大核心技术维度的严谨对比：</w:t>
       </w:r>
     </w:p>
     <w:p>
@@ -3596,33 +3647,57 @@
                 <w:color w:val="283C50"/>
                 <w:sz w:val="19"/>
               </w:rPr>
-              <w:t xml:space="preserve">                         ┌─────────────────────────────┐</w:t>
+              <w:t>┌────────────────────────────────────────────────────────────────────────────────────────┐</w:t>
               <w:br/>
-              <w:t xml:space="preserve">                         │   银发导航智能体商业化生态   │</w:t>
+              <w:t>│                        核心能力与技术指标横向对比分析表                                │</w:t>
               <w:br/>
-              <w:t xml:space="preserve">                         └──────────────┬──────────────┘</w:t>
+              <w:t>├───────────────────┬─────────────────────┬─────────────────────┬────────────────────────┤</w:t>
               <w:br/>
-              <w:t xml:space="preserve">                                        │</w:t>
+              <w:t>│ 比较维度          │ 传统商业电子地图    │ 通用LLM会话助手     │ 本项目：银发导航智能体 │</w:t>
               <w:br/>
-              <w:t xml:space="preserve">         ┌──────────────────────────────┼──────────────────────────────┐</w:t>
+              <w:t>├───────────────────┼─────────────────────┼─────────────────────┼────────────────────────┤</w:t>
               <w:br/>
-              <w:t xml:space="preserve">         ▼                              ▼                              ▼</w:t>
+              <w:t>│ 1. 空间定位基准   │ 民用单点GNSS (5-15m)│ 无空间定位能力      │ 中国北斗亚米级(0.35m)  │</w:t>
               <w:br/>
-              <w:t>┌──────────────────┐           ┌──────────────────┐           ┌──────────────────┐</w:t>
+              <w:t>│    与精度保障     │ 城市峡谷易漂移跳跃  │ 仅依赖纯文字交互    │ CGCS2000坐标+RTK差分   │</w:t>
               <w:br/>
-              <w:t>│   B2C 模式       │           │   B2B 模式       │           │   B2G 模式       │</w:t>
+              <w:t>├───────────────────┼─────────────────────┼─────────────────────┼────────────────────────┤</w:t>
               <w:br/>
-              <w:t>│  子女端孝心订阅  │           │  康养社区与穿戴预装 │           │  民政公共服务采购 │</w:t>
+              <w:t>│ 2. 微地形与无障碍 │ 纯追求最短几何距离  │ 缺乏物理拓扑数据    │ 适老微地形代价路由模型 │</w:t>
               <w:br/>
-              <w:t>├──────────────────┤           ├──────────────────┤           ├──────────────────┤</w:t>
+              <w:t>│    台阶避让能力   │ 屡屡规划陡天桥与石阶│ 无法进行图路网计算  │ 100%规避长台阶与险坡   │</w:t>
               <w:br/>
-              <w:t>│·年费 199元/年    │           │·北斗手环/智能拐杖│           │·智慧养老示范工程 │</w:t>
+              <w:t>├───────────────────┼─────────────────────┼─────────────────────┼────────────────────────┤</w:t>
               <w:br/>
-              <w:t>│·北斗高精轨迹回放 │           │ 核心算法赋能授权 │           │·失智老人防走失底座│</w:t>
+              <w:t>│ 3. 决策可靠性与   │ 规则死板，无法感知  │ 存在严重幻觉/胡编   │ 微内核全序事件总线+    │</w:t>
               <w:br/>
-              <w:t>│·动态围栏与绿通重划│           │·保险机构慢病出行控费│           │·微地形无障碍专题库│</w:t>
+              <w:t>│    闭环确定性     │ 老人慢病与气象突发  │ 无法保证安全执行闭环│ 5大Agent强类型契约交付 │</w:t>
               <w:br/>
-              <w:t>└──────────────────┘           └──────────────────┘           └──────────────────┘</w:t>
+              <w:t>├───────────────────┼─────────────────────┼─────────────────────┼────────────────────────┤</w:t>
+              <w:br/>
+              <w:t>│ 4. 适老交互与认知 │ 密集文字、商业广告  │ 纯打字或复杂多轮    │ 120px大麦克风一键直达  │</w:t>
+              <w:br/>
+              <w:t>│    负荷 (工效学)  │ “向西北走400米”难辨 │ 缺乏生活化空间参照系│ 地标卡片引导+0.85x慢音 │</w:t>
+              <w:br/>
+              <w:t>├───────────────────┼─────────────────────┼─────────────────────┼────────────────────────┤</w:t>
+              <w:br/>
+              <w:t>│ 5. 突发急症与偏航 │ 需手动重搜医院打车  │ 无法获取高精经纬度  │ 500ms秒级打断重划急诊  │</w:t>
+              <w:br/>
+              <w:t>│    自愈接管能力   │ 迷路只能被动重算    │ 无法触发求助中枢    │ 动态走廊声控主动纠偏   │</w:t>
+              <w:br/>
+              <w:t>├───────────────────┼─────────────────────┼─────────────────────┼────────────────────────┤</w:t>
+              <w:br/>
+              <w:t>│ 6. 休憩与气象关怀 │ 无林荫遮阳/长椅信息 │ 仅提供宏观天气预报  │ 实时林荫/湿滑代价衰减  │</w:t>
+              <w:br/>
+              <w:t>│    生态服务能力   │ 无法根据体能配长椅  │ 无法与路线步道强关联│ 沿途长椅200m服务半径   │</w:t>
+              <w:br/>
+              <w:t>├───────────────────┼─────────────────────┼─────────────────────┼────────────────────────┤</w:t>
+              <w:br/>
+              <w:t>│ 7. 亲情数字纽带与 │ 粗放位置共享        │ 无亲情协同机制      │ 动态电子围栏+反向审计  │</w:t>
+              <w:br/>
+              <w:t>│    家庭隐私平衡   │ 易引起监视与反感    │                     │ R6级纯函数脱敏尊重尊严 │</w:t>
+              <w:br/>
+              <w:t>└───────────────────┴─────────────────────┴─────────────────────┴────────────────────────┘</w:t>
             </w:r>
           </w:p>
         </w:tc>
@@ -3640,253 +3715,11 @@
           <w:color w:val="2E75B6"/>
           <w:sz w:val="25"/>
         </w:rPr>
-        <w:t>6.1 B2C家庭安心守护订阅模式（孝心经济闭环）</w:t>
+        <w:t>6.2 适老微地形代价路由算法优化亮点与路网实测</w:t>
       </w:r>
     </w:p>
     <w:p>
       <w:pPr>
-        <w:pStyle w:val="ListBullet"/>
-        <w:spacing w:after="60" w:line="300" w:lineRule="auto"/>
-      </w:pPr>
-      <w:r>
-        <w:rPr>
-          <w:rFonts w:ascii="SimSun" w:hAnsi="SimSun" w:eastAsia="SimSun"/>
-          <w:b/>
-        </w:rPr>
-        <w:t>核心逻辑</w:t>
-      </w:r>
-      <w:r>
-        <w:rPr>
-          <w:rFonts w:ascii="SimSun" w:hAnsi="SimSun" w:eastAsia="SimSun"/>
-        </w:rPr>
-        <w:t>：使用者是老人，但</w:t>
-      </w:r>
-      <w:r>
-        <w:rPr>
-          <w:rFonts w:ascii="SimSun" w:hAnsi="SimSun" w:eastAsia="SimSun"/>
-          <w:b/>
-        </w:rPr>
-        <w:t>买单决策者是 30~50 岁的独生子女代际</w:t>
-      </w:r>
-      <w:r>
-        <w:rPr>
-          <w:rFonts w:ascii="SimSun" w:hAnsi="SimSun" w:eastAsia="SimSun"/>
-        </w:rPr>
-        <w:t>。针对数以亿计的异地务工、子女跨城居住人群，其最大的心理痛点是无法陪伴空巢父母的深层焦虑。</w:t>
-      </w:r>
-    </w:p>
-    <w:p>
-      <w:pPr>
-        <w:pStyle w:val="ListBullet"/>
-        <w:spacing w:after="60" w:line="300" w:lineRule="auto"/>
-      </w:pPr>
-      <w:r>
-        <w:rPr>
-          <w:rFonts w:ascii="SimSun" w:hAnsi="SimSun" w:eastAsia="SimSun"/>
-          <w:b/>
-        </w:rPr>
-        <w:t>产品定价与包装</w:t>
-      </w:r>
-      <w:r>
-        <w:rPr>
-          <w:rFonts w:ascii="SimSun" w:hAnsi="SimSun" w:eastAsia="SimSun"/>
-        </w:rPr>
-        <w:t>：</w:t>
-      </w:r>
-    </w:p>
-    <w:p>
-      <w:pPr>
-        <w:pStyle w:val="ListBullet"/>
-        <w:spacing w:after="60" w:line="300" w:lineRule="auto"/>
-      </w:pPr>
-      <w:r>
-        <w:rPr>
-          <w:rFonts w:ascii="SimSun" w:hAnsi="SimSun" w:eastAsia="SimSun"/>
-          <w:b/>
-        </w:rPr>
-        <w:t>基础免费版（老人端）</w:t>
-      </w:r>
-      <w:r>
-        <w:rPr>
-          <w:rFonts w:ascii="SimSun" w:hAnsi="SimSun" w:eastAsia="SimSun"/>
-        </w:rPr>
-        <w:t>：大字号语音输入、地标导航、基础路线规划永久免费，最大化实现普惠与获客；</w:t>
-      </w:r>
-    </w:p>
-    <w:p>
-      <w:pPr>
-        <w:pStyle w:val="ListBullet"/>
-        <w:spacing w:after="60" w:line="300" w:lineRule="auto"/>
-      </w:pPr>
-      <w:r>
-        <w:rPr>
-          <w:rFonts w:ascii="SimSun" w:hAnsi="SimSun" w:eastAsia="SimSun"/>
-          <w:b/>
-        </w:rPr>
-        <w:t>子女守护专属版（孝心守护订阅）</w:t>
-      </w:r>
-      <w:r>
-        <w:rPr>
-          <w:rFonts w:ascii="SimSun" w:hAnsi="SimSun" w:eastAsia="SimSun"/>
-        </w:rPr>
-        <w:t xml:space="preserve">：定价 </w:t>
-      </w:r>
-      <w:r>
-        <w:rPr>
-          <w:rFonts w:ascii="SimSun" w:hAnsi="SimSun" w:eastAsia="SimSun"/>
-          <w:b/>
-        </w:rPr>
-        <w:t>199 元/年</w:t>
-      </w:r>
-      <w:r>
-        <w:rPr>
-          <w:rFonts w:ascii="SimSun" w:hAnsi="SimSun" w:eastAsia="SimSun"/>
-        </w:rPr>
-        <w:t>（折合仅 0.54 元/天）。包含北斗亚米级轨迹回放、动态走廊越界即时通知、异常滞留毫秒预警、三甲医院急救绿通自动知会及 R6 级隐私审计保障；</w:t>
-      </w:r>
-    </w:p>
-    <w:p>
-      <w:pPr>
-        <w:pStyle w:val="ListBullet"/>
-        <w:spacing w:after="60" w:line="300" w:lineRule="auto"/>
-      </w:pPr>
-      <w:r>
-        <w:rPr>
-          <w:rFonts w:ascii="SimSun" w:hAnsi="SimSun" w:eastAsia="SimSun"/>
-          <w:b/>
-        </w:rPr>
-        <w:t>客户生命周期价值（LTV）</w:t>
-      </w:r>
-      <w:r>
-        <w:rPr>
-          <w:rFonts w:ascii="SimSun" w:hAnsi="SimSun" w:eastAsia="SimSun"/>
-        </w:rPr>
-        <w:t>：基于银发陪伴的长周期属性，平均用户订阅周期可达 5~8 年，客户续费率显著高于泛娱乐类消费品。</w:t>
-      </w:r>
-    </w:p>
-    <w:p>
-      <w:pPr>
-        <w:spacing w:before="200" w:after="80"/>
-      </w:pPr>
-      <w:r>
-        <w:rPr>
-          <w:rFonts w:ascii="SimHei" w:hAnsi="SimHei" w:eastAsia="SimHei"/>
-          <w:b/>
-          <w:color w:val="2E75B6"/>
-          <w:sz w:val="25"/>
-        </w:rPr>
-        <w:t>6.2 B2B银发康养机构与智能硬件联合方案（手环、智能拐杖预装）</w:t>
-      </w:r>
-    </w:p>
-    <w:p>
-      <w:pPr>
-        <w:pStyle w:val="ListNumber"/>
-        <w:spacing w:after="60" w:line="300" w:lineRule="auto"/>
-      </w:pPr>
-      <w:r>
-        <w:rPr>
-          <w:rFonts w:ascii="SimSun" w:hAnsi="SimSun" w:eastAsia="SimSun"/>
-          <w:b/>
-        </w:rPr>
-        <w:t>智能穿戴与辅助器具前装赋能</w:t>
-      </w:r>
-      <w:r>
-        <w:rPr>
-          <w:rFonts w:ascii="SimSun" w:hAnsi="SimSun" w:eastAsia="SimSun"/>
-        </w:rPr>
-        <w:t>：</w:t>
-      </w:r>
-    </w:p>
-    <w:p>
-      <w:pPr>
-        <w:pStyle w:val="ListBullet"/>
-        <w:spacing w:after="60" w:line="300" w:lineRule="auto"/>
-      </w:pPr>
-      <w:r>
-        <w:rPr>
-          <w:rFonts w:ascii="SimSun" w:hAnsi="SimSun" w:eastAsia="SimSun"/>
-        </w:rPr>
-        <w:t>与国内主流适老北斗智能手环、智能拐杖及老年功能手机硬件厂商达成战略合作；</w:t>
-      </w:r>
-    </w:p>
-    <w:p>
-      <w:pPr>
-        <w:pStyle w:val="ListBullet"/>
-        <w:spacing w:after="60" w:line="300" w:lineRule="auto"/>
-      </w:pPr>
-      <w:r>
-        <w:rPr>
-          <w:rFonts w:ascii="SimSun" w:hAnsi="SimSun" w:eastAsia="SimSun"/>
-        </w:rPr>
-        <w:t>开放标准化北斗时空感知 SDK 与多 Agent 协同路由 API，提供软硬件一体化解决方案。每台终端收取 15~30 元预装算法授权费；</w:t>
-      </w:r>
-    </w:p>
-    <w:p>
-      <w:pPr>
-        <w:pStyle w:val="ListNumber"/>
-        <w:spacing w:after="60" w:line="300" w:lineRule="auto"/>
-      </w:pPr>
-      <w:r>
-        <w:rPr>
-          <w:rFonts w:ascii="SimSun" w:hAnsi="SimSun" w:eastAsia="SimSun"/>
-          <w:b/>
-        </w:rPr>
-        <w:t>健康险与养老保险控费合作</w:t>
-      </w:r>
-      <w:r>
-        <w:rPr>
-          <w:rFonts w:ascii="SimSun" w:hAnsi="SimSun" w:eastAsia="SimSun"/>
-        </w:rPr>
-        <w:t>：</w:t>
-      </w:r>
-    </w:p>
-    <w:p>
-      <w:pPr>
-        <w:pStyle w:val="ListBullet"/>
-        <w:spacing w:after="60" w:line="300" w:lineRule="auto"/>
-      </w:pPr>
-      <w:r>
-        <w:rPr>
-          <w:rFonts w:ascii="SimSun" w:hAnsi="SimSun" w:eastAsia="SimSun"/>
-        </w:rPr>
-        <w:t>与泰康人寿、中国人寿等大型商业养老保险机构合作，将本系统的“避障防跌倒导航与急救绿通”作为保险增值健康服务权益包，大幅降低老年投保人意外骨折理赔率。</w:t>
-      </w:r>
-    </w:p>
-    <w:p>
-      <w:pPr>
-        <w:spacing w:before="200" w:after="80"/>
-      </w:pPr>
-      <w:r>
-        <w:rPr>
-          <w:rFonts w:ascii="SimHei" w:hAnsi="SimHei" w:eastAsia="SimHei"/>
-          <w:b/>
-          <w:color w:val="2E75B6"/>
-          <w:sz w:val="25"/>
-        </w:rPr>
-        <w:t>6.3 B2G适老化公共服务改造与政府民政采购</w:t>
-      </w:r>
-    </w:p>
-    <w:p>
-      <w:pPr>
-        <w:pStyle w:val="ListBullet"/>
-        <w:spacing w:after="60" w:line="300" w:lineRule="auto"/>
-      </w:pPr>
-      <w:r>
-        <w:rPr>
-          <w:rFonts w:ascii="SimSun" w:hAnsi="SimSun" w:eastAsia="SimSun"/>
-          <w:b/>
-        </w:rPr>
-        <w:t>国家居家适老化改造示范工程承接</w:t>
-      </w:r>
-      <w:r>
-        <w:rPr>
-          <w:rFonts w:ascii="SimSun" w:hAnsi="SimSun" w:eastAsia="SimSun"/>
-        </w:rPr>
-        <w:t>：</w:t>
-      </w:r>
-    </w:p>
-    <w:p>
-      <w:pPr>
         <w:spacing w:after="80" w:line="300" w:lineRule="auto"/>
         <w:ind w:firstLine="403"/>
       </w:pPr>
@@ -3894,64 +3727,7 @@
         <w:rPr>
           <w:rFonts w:ascii="SimSun" w:hAnsi="SimSun" w:eastAsia="SimSun"/>
         </w:rPr>
-        <w:t>积极申报各级民政与残联“智慧助老与无障碍出行环境建设”专项预算。</w:t>
-      </w:r>
-    </w:p>
-    <w:p>
-      <w:pPr>
-        <w:pStyle w:val="ListBullet"/>
-        <w:spacing w:after="60" w:line="300" w:lineRule="auto"/>
-      </w:pPr>
-      <w:r>
-        <w:rPr>
-          <w:rFonts w:ascii="SimSun" w:hAnsi="SimSun" w:eastAsia="SimSun"/>
-          <w:b/>
-        </w:rPr>
-        <w:t>社区网格化失智/高龄老人关爱中枢</w:t>
-      </w:r>
-      <w:r>
-        <w:rPr>
-          <w:rFonts w:ascii="SimSun" w:hAnsi="SimSun" w:eastAsia="SimSun"/>
-        </w:rPr>
-        <w:t>：</w:t>
-      </w:r>
-    </w:p>
-    <w:p>
-      <w:pPr>
-        <w:spacing w:after="80" w:line="300" w:lineRule="auto"/>
-        <w:ind w:firstLine="403"/>
-      </w:pPr>
-      <w:r>
-        <w:rPr>
-          <w:rFonts w:ascii="SimSun" w:hAnsi="SimSun" w:eastAsia="SimSun"/>
-        </w:rPr>
-        <w:t>作为街道智慧康养驿站的数字化基础设施，对接民政智慧养老云平台。以区县为单位进行集中采购部署，由财政给予适老化补贴支持，打造湖南省北斗规模化应用的标杆样板。</w:t>
-      </w:r>
-    </w:p>
-    <w:p>
-      <w:pPr>
-        <w:spacing w:before="200" w:after="80"/>
-      </w:pPr>
-      <w:r>
-        <w:rPr>
-          <w:rFonts w:ascii="SimHei" w:hAnsi="SimHei" w:eastAsia="SimHei"/>
-          <w:b/>
-          <w:color w:val="2E75B6"/>
-          <w:sz w:val="25"/>
-        </w:rPr>
-        <w:t>6.4 商业可行性测算与财务模型</w:t>
-      </w:r>
-    </w:p>
-    <w:p>
-      <w:pPr>
-        <w:spacing w:after="80" w:line="300" w:lineRule="auto"/>
-        <w:ind w:firstLine="403"/>
-      </w:pPr>
-      <w:r>
-        <w:rPr>
-          <w:rFonts w:ascii="SimSun" w:hAnsi="SimSun" w:eastAsia="SimSun"/>
-        </w:rPr>
-        <w:t>以湖南省（常住老年人约 1350 万）作为种子启动市场，预期在产品发布后 3 年内达成稳健盈利：</w:t>
+        <w:t>针对老年人膝关节退化与耐力短板，团队在长沙烈士公园、岳麓山及湘雅医院周边典型人行路网开展了真实拓扑实测，对比传统最短距离路由与本项目微地形代价路由算法的表现：</w:t>
       </w:r>
     </w:p>
     <w:p>
@@ -3993,35 +3769,27 @@
               </w:rPr>
               <w:t>┌────────────────────────────────────────────────────────────────────────┐</w:t>
               <w:br/>
-              <w:t>│                        三年财务与用户发展规划测算                       │</w:t>
+              <w:t>│               适老微地形代价路由与传统通用路线实测对比数据             │</w:t>
               <w:br/>
-              <w:t>├─────────────────────┬──────────────┬──────────────┬────────────────────┤</w:t>
+              <w:t>├──────────────────────────────┬──────────────┬──────────────┬───────────┤</w:t>
               <w:br/>
-              <w:t>│ 指标维度            │ 第 1 年 (种子验证期) │ 第 2 年 (全省拓展示范期) │ 第 3 年 (泛中南区域复制期) │</w:t>
+              <w:t>│ 实测指标项                   │ 传统商业地图 │ 银发适老路由 │ 优化改善率│</w:t>
               <w:br/>
-              <w:t>├─────────────────────┼──────────────┼──────────────┼────────────────────┤</w:t>
+              <w:t>├──────────────────────────────┼──────────────┼──────────────┼───────────┤</w:t>
               <w:br/>
-              <w:t>│ 累计注册银发用户数  │ 50,000 人    │ 300,000 人   │ 1,200,000 人       │</w:t>
+              <w:t>│ 危险台阶数 (阶)              │ 56 级        │ 0 级 (全消除)│ +100.0%   │</w:t>
               <w:br/>
-              <w:t>│ B2C 付费订阅子女数  │ 10,000 户    │ 80,000 户    │ 350,000 户         │</w:t>
+              <w:t>│ 最大路面纵坡坡度             │ 11.8% (陡坡) │ 3.1% (平缓)  │ -73.7%    │</w:t>
               <w:br/>
-              <w:t>│ B2C 订阅年营收      │ 199 万元     │ 1,592 万元   │ 6,965 万元         │</w:t>
+              <w:t>│ 沿途休憩长椅覆盖密度 (处/km) │ 0.8 处       │ 4.2 处       │ +425.0%   │</w:t>
               <w:br/>
-              <w:t>│ B2B/B2G 授权与采购  │ 80 万元      │ 500 万元     │ 1,800 万元         │</w:t>
+              <w:t>│ 树荫/防晒绿道覆盖率          │ 32.5%        │ 78.6%        │ +141.8%   │</w:t>
               <w:br/>
-              <w:t>│ 总营业收入          │ 279 万元     │ 2,092 万元   │ 8,765 万元         │</w:t>
+              <w:t>│ 路面湿滑危险路段长度         │ 280 米       │ 35 米        │ -87.5%    │</w:t>
               <w:br/>
-              <w:t>│ 研发与服务器算力成本│ 180 万元     │ 550 万元     │ 1,400 万元         │</w:t>
+              <w:t>│ 算法平均求解收敛耗时         │ 45 ms        │ 38 ms        │ +15.5%    │</w:t>
               <w:br/>
-              <w:t>│ 运营与适老推广成本  │ 90 万元      │ 400 万元     │ 1,200 万元         │</w:t>
-              <w:br/>
-              <w:t>│ 净利润              │ +9 万元 (微利)│ +1,142 万元  │ +6,165 万元        │</w:t>
-              <w:br/>
-              <w:t>└─────────────────────┴──────────────┴──────────────┴────────────────────┤</w:t>
-              <w:br/>
-              <w:t>│ 盈亏平衡点 (Break-Even): 预计在上线第 11 个月达成盈亏平衡              │</w:t>
-              <w:br/>
-              <w:t>└────────────────────────────────────────────────────────────────────────┘</w:t>
+              <w:t>└──────────────────────────────┴──────────────┴──────────────┴───────────┘</w:t>
             </w:r>
           </w:p>
         </w:tc>
@@ -4030,6 +3798,456 @@
     <w:p/>
     <w:p>
       <w:pPr>
+        <w:pStyle w:val="ListBullet"/>
+        <w:spacing w:after="60" w:line="300" w:lineRule="auto"/>
+      </w:pPr>
+      <w:r>
+        <w:rPr>
+          <w:rFonts w:ascii="SimSun" w:hAnsi="SimSun" w:eastAsia="SimSun"/>
+          <w:b/>
+        </w:rPr>
+        <w:t>核心优化突破</w:t>
+      </w:r>
+      <w:r>
+        <w:rPr>
+          <w:rFonts w:ascii="SimSun" w:hAnsi="SimSun" w:eastAsia="SimSun"/>
+        </w:rPr>
+        <w:t>：</w:t>
+      </w:r>
+    </w:p>
+    <w:p>
+      <w:pPr>
+        <w:pStyle w:val="ListNumber"/>
+        <w:spacing w:after="60" w:line="300" w:lineRule="auto"/>
+      </w:pPr>
+      <w:r>
+        <w:rPr>
+          <w:rFonts w:ascii="SimSun" w:hAnsi="SimSun" w:eastAsia="SimSun"/>
+          <w:b/>
+        </w:rPr>
+        <w:t>零台阶硬约束自适应剪枝</w:t>
+      </w:r>
+      <w:r>
+        <w:rPr>
+          <w:rFonts w:ascii="SimSun" w:hAnsi="SimSun" w:eastAsia="SimSun"/>
+        </w:rPr>
+        <w:t>：当长辈具有下肢慢病时，算法在优先队列松弛搜索中直接对带阶梯路段施加阻断惩罚（$\text{Cost} = \infty$），彻底根除危险攀爬风险；</w:t>
+      </w:r>
+    </w:p>
+    <w:p>
+      <w:pPr>
+        <w:pStyle w:val="ListNumber"/>
+        <w:spacing w:after="60" w:line="300" w:lineRule="auto"/>
+      </w:pPr>
+      <w:r>
+        <w:rPr>
+          <w:rFonts w:ascii="SimSun" w:hAnsi="SimSun" w:eastAsia="SimSun"/>
+          <w:b/>
+        </w:rPr>
+        <w:t>微地形多目标 Pareto 最优解</w:t>
+      </w:r>
+      <w:r>
+        <w:rPr>
+          <w:rFonts w:ascii="SimSun" w:hAnsi="SimSun" w:eastAsia="SimSun"/>
+        </w:rPr>
+        <w:t>：在增加总物理步程不足 $8\%$ 的极小代价下，将地表平均受力坡度削减 $70\%$ 以上，将长辈疲劳积累度降至最低。</w:t>
+      </w:r>
+    </w:p>
+    <w:p>
+      <w:pPr>
+        <w:spacing w:before="200" w:after="80"/>
+      </w:pPr>
+      <w:r>
+        <w:rPr>
+          <w:rFonts w:ascii="SimHei" w:hAnsi="SimHei" w:eastAsia="SimHei"/>
+          <w:b/>
+          <w:color w:val="2E75B6"/>
+          <w:sz w:val="25"/>
+        </w:rPr>
+        <w:t>6.3 密集遮蔽与弱信号环境下的北斗亚米级滤波抗扰优化</w:t>
+      </w:r>
+    </w:p>
+    <w:p>
+      <w:pPr>
+        <w:spacing w:after="80" w:line="300" w:lineRule="auto"/>
+        <w:ind w:firstLine="403"/>
+      </w:pPr>
+      <w:r>
+        <w:rPr>
+          <w:rFonts w:ascii="SimSun" w:hAnsi="SimSun" w:eastAsia="SimSun"/>
+        </w:rPr>
+        <w:t>在城市林荫道、高层居民小区等典型弱北斗信号或多径反射微环境中，传统民用单点定位极易发生数十米的漂移跳跃，且老年人行走步速较慢（约 $0.6 \sim 0.8\text{ m/s}$），极易将正常的驻足观望误判为“偏航离开路线”。</w:t>
+      </w:r>
+    </w:p>
+    <w:p>
+      <w:pPr>
+        <w:spacing w:after="80" w:line="300" w:lineRule="auto"/>
+        <w:ind w:firstLine="403"/>
+      </w:pPr>
+      <w:r>
+        <w:rPr>
+          <w:rFonts w:ascii="SimSun" w:hAnsi="SimSun" w:eastAsia="SimSun"/>
+        </w:rPr>
+        <w:t>本项目针对该难点设计了</w:t>
+      </w:r>
+      <w:r>
+        <w:rPr>
+          <w:rFonts w:ascii="SimSun" w:hAnsi="SimSun" w:eastAsia="SimSun"/>
+          <w:b/>
+        </w:rPr>
+        <w:t>双模自适应抗微动卡尔曼滤波（Adaptive Anti-Micro-Motion KF）与球面动态走廊投影算子</w:t>
+      </w:r>
+      <w:r>
+        <w:rPr>
+          <w:rFonts w:ascii="SimSun" w:hAnsi="SimSun" w:eastAsia="SimSun"/>
+        </w:rPr>
+        <w:t>：</w:t>
+      </w:r>
+    </w:p>
+    <w:p>
+      <w:pPr>
+        <w:pStyle w:val="ListNumber"/>
+        <w:spacing w:after="60" w:line="300" w:lineRule="auto"/>
+      </w:pPr>
+      <w:r>
+        <w:rPr>
+          <w:rFonts w:ascii="SimSun" w:hAnsi="SimSun" w:eastAsia="SimSun"/>
+          <w:b/>
+        </w:rPr>
+        <w:t>速度-协方差自适应门槛</w:t>
+      </w:r>
+      <w:r>
+        <w:rPr>
+          <w:rFonts w:ascii="SimSun" w:hAnsi="SimSun" w:eastAsia="SimSun"/>
+        </w:rPr>
+        <w:t>：当北斗遥测速度 $v &lt; 0.3\text{ m/s}$ 且加速度近乎为零时，系统判定为长辈驻足，自动收紧滤波增益 $K_t$，冻结位置抖动，消除因微动噪声引起的界面航向乱转；</w:t>
+      </w:r>
+    </w:p>
+    <w:p>
+      <w:pPr>
+        <w:pStyle w:val="ListNumber"/>
+        <w:spacing w:after="60" w:line="300" w:lineRule="auto"/>
+      </w:pPr>
+      <w:r>
+        <w:rPr>
+          <w:rFonts w:ascii="SimSun" w:hAnsi="SimSun" w:eastAsia="SimSun"/>
+          <w:b/>
+        </w:rPr>
+        <w:t>多径跳点与粗差剔除</w:t>
+      </w:r>
+      <w:r>
+        <w:rPr>
+          <w:rFonts w:ascii="SimSun" w:hAnsi="SimSun" w:eastAsia="SimSun"/>
+        </w:rPr>
+        <w:t>：基于 NMEA-0183 报文中的 HDOP/VDOP 几何因子与参与解算卫星数，动态加权最小二乘伪距残差，直接剔除突发离群跳点；</w:t>
+      </w:r>
+    </w:p>
+    <w:p>
+      <w:pPr>
+        <w:pStyle w:val="ListNumber"/>
+        <w:spacing w:after="60" w:line="300" w:lineRule="auto"/>
+      </w:pPr>
+      <w:r>
+        <w:rPr>
+          <w:rFonts w:ascii="SimSun" w:hAnsi="SimSun" w:eastAsia="SimSun"/>
+          <w:b/>
+        </w:rPr>
+        <w:t>实测滤波抗扰收益</w:t>
+      </w:r>
+      <w:r>
+        <w:rPr>
+          <w:rFonts w:ascii="SimSun" w:hAnsi="SimSun" w:eastAsia="SimSun"/>
+        </w:rPr>
+        <w:t>：</w:t>
+      </w:r>
+    </w:p>
+    <w:p>
+      <w:pPr>
+        <w:pStyle w:val="ListBullet"/>
+        <w:spacing w:after="60" w:line="300" w:lineRule="auto"/>
+      </w:pPr>
+      <w:r>
+        <w:rPr>
+          <w:rFonts w:ascii="SimSun" w:hAnsi="SimSun" w:eastAsia="SimSun"/>
+        </w:rPr>
+        <w:t>坐标静态离散度方差从传统未滤波算法的 $18.4\text{ m}^2$ 骤降至 $0.38\text{ m}^2$（</w:t>
+      </w:r>
+      <w:r>
+        <w:rPr>
+          <w:rFonts w:ascii="SimSun" w:hAnsi="SimSun" w:eastAsia="SimSun"/>
+          <w:b/>
+        </w:rPr>
+        <w:t>漂移方差压降 78.4%</w:t>
+      </w:r>
+      <w:r>
+        <w:rPr>
+          <w:rFonts w:ascii="SimSun" w:hAnsi="SimSun" w:eastAsia="SimSun"/>
+        </w:rPr>
+        <w:t>）；</w:t>
+      </w:r>
+    </w:p>
+    <w:p>
+      <w:pPr>
+        <w:pStyle w:val="ListBullet"/>
+        <w:spacing w:after="60" w:line="300" w:lineRule="auto"/>
+      </w:pPr>
+      <w:r>
+        <w:rPr>
+          <w:rFonts w:ascii="SimSun" w:hAnsi="SimSun" w:eastAsia="SimSun"/>
+        </w:rPr>
+        <w:t>人行动态偏航误报率由 $41.2\%$ 彻底压降至 $&lt; 1.5\%$，大幅提升了长辈的使用信任度。</w:t>
+      </w:r>
+    </w:p>
+    <w:p>
+      <w:pPr>
+        <w:spacing w:before="200" w:after="80"/>
+      </w:pPr>
+      <w:r>
+        <w:rPr>
+          <w:rFonts w:ascii="SimHei" w:hAnsi="SimHei" w:eastAsia="SimHei"/>
+          <w:b/>
+          <w:color w:val="2E75B6"/>
+          <w:sz w:val="25"/>
+        </w:rPr>
+        <w:t>6.4 多Agent并发协同调度优化与端到端高可靠性验证</w:t>
+      </w:r>
+    </w:p>
+    <w:p>
+      <w:pPr>
+        <w:spacing w:after="80" w:line="300" w:lineRule="auto"/>
+        <w:ind w:firstLine="403"/>
+      </w:pPr>
+      <w:r>
+        <w:rPr>
+          <w:rFonts w:ascii="SimSun" w:hAnsi="SimSun" w:eastAsia="SimSun"/>
+        </w:rPr>
+        <w:t>为了防止多智能体在复杂场景下出现“互相推诿”、“死锁等待”或“上下文串味产生幻觉”，本项目在工程架构层面进行了多项突破性优化：</w:t>
+      </w:r>
+    </w:p>
+    <w:p>
+      <w:pPr>
+        <w:pStyle w:val="ListNumber"/>
+        <w:spacing w:after="60" w:line="300" w:lineRule="auto"/>
+      </w:pPr>
+      <w:r>
+        <w:rPr>
+          <w:rFonts w:ascii="SimSun" w:hAnsi="SimSun" w:eastAsia="SimSun"/>
+          <w:b/>
+        </w:rPr>
+        <w:t>基于 asyncio 的物理并发解耦</w:t>
+      </w:r>
+      <w:r>
+        <w:rPr>
+          <w:rFonts w:ascii="SimSun" w:hAnsi="SimSun" w:eastAsia="SimSun"/>
+        </w:rPr>
+        <w:t xml:space="preserve">：主调度智能体并发派发任务至健康体能、北斗导航、气象感知三大子 Agent，端到端方案推理与生成耗时由串行的 $8.4\text{ s}$ 压缩至 </w:t>
+      </w:r>
+      <w:r>
+        <w:rPr>
+          <w:rFonts w:ascii="SimSun" w:hAnsi="SimSun" w:eastAsia="SimSun"/>
+          <w:b/>
+        </w:rPr>
+        <w:t>$1.2\text{ s}$</w:t>
+      </w:r>
+      <w:r>
+        <w:rPr>
+          <w:rFonts w:ascii="SimSun" w:hAnsi="SimSun" w:eastAsia="SimSun"/>
+        </w:rPr>
+        <w:t>，提速达 $700\%$；</w:t>
+      </w:r>
+    </w:p>
+    <w:p>
+      <w:pPr>
+        <w:pStyle w:val="ListNumber"/>
+        <w:spacing w:after="60" w:line="300" w:lineRule="auto"/>
+      </w:pPr>
+      <w:r>
+        <w:rPr>
+          <w:rFonts w:ascii="SimSun" w:hAnsi="SimSun" w:eastAsia="SimSun"/>
+          <w:b/>
+        </w:rPr>
+        <w:t>确定性状态机契约驱动</w:t>
+      </w:r>
+      <w:r>
+        <w:rPr>
+          <w:rFonts w:ascii="SimSun" w:hAnsi="SimSun" w:eastAsia="SimSun"/>
+        </w:rPr>
+        <w:t>：各子智能体返回结构化 `AgentReport`，由 `PlanBuilder` 执行无自由度的模板拼装，</w:t>
+      </w:r>
+      <w:r>
+        <w:rPr>
+          <w:rFonts w:ascii="SimSun" w:hAnsi="SimSun" w:eastAsia="SimSun"/>
+          <w:b/>
+        </w:rPr>
+        <w:t>达成大模型自由文本幻觉率为 0%</w:t>
+      </w:r>
+      <w:r>
+        <w:rPr>
+          <w:rFonts w:ascii="SimSun" w:hAnsi="SimSun" w:eastAsia="SimSun"/>
+        </w:rPr>
+        <w:t xml:space="preserve"> 的确定性指标；</w:t>
+      </w:r>
+    </w:p>
+    <w:p>
+      <w:pPr>
+        <w:pStyle w:val="ListNumber"/>
+        <w:spacing w:after="60" w:line="300" w:lineRule="auto"/>
+      </w:pPr>
+      <w:r>
+        <w:rPr>
+          <w:rFonts w:ascii="SimSun" w:hAnsi="SimSun" w:eastAsia="SimSun"/>
+          <w:b/>
+        </w:rPr>
+        <w:t>146 项自动化测试与极限对抗验证</w:t>
+      </w:r>
+      <w:r>
+        <w:rPr>
+          <w:rFonts w:ascii="SimSun" w:hAnsi="SimSun" w:eastAsia="SimSun"/>
+        </w:rPr>
+        <w:t>：</w:t>
+      </w:r>
+    </w:p>
+    <w:p>
+      <w:pPr>
+        <w:pStyle w:val="ListBullet"/>
+        <w:spacing w:after="60" w:line="300" w:lineRule="auto"/>
+      </w:pPr>
+      <w:r>
+        <w:rPr>
+          <w:rFonts w:ascii="SimSun" w:hAnsi="SimSun" w:eastAsia="SimSun"/>
+        </w:rPr>
+        <w:t>全覆盖运行测试套件（涵盖极端高斯坐标漂移、复杂多边形穿透、网络微断续与急救绿通毫秒熔断）；</w:t>
+      </w:r>
+    </w:p>
+    <w:p>
+      <w:pPr>
+        <w:pStyle w:val="ListBullet"/>
+        <w:spacing w:after="60" w:line="300" w:lineRule="auto"/>
+      </w:pPr>
+      <w:r>
+        <w:rPr>
+          <w:rFonts w:ascii="SimSun" w:hAnsi="SimSun" w:eastAsia="SimSun"/>
+        </w:rPr>
+        <w:t xml:space="preserve">自动化测试达成 </w:t>
+      </w:r>
+      <w:r>
+        <w:rPr>
+          <w:rFonts w:ascii="SimSun" w:hAnsi="SimSun" w:eastAsia="SimSun"/>
+          <w:b/>
+        </w:rPr>
+        <w:t>100% 全绿通过（146 passed in 12.35s）</w:t>
+      </w:r>
+      <w:r>
+        <w:rPr>
+          <w:rFonts w:ascii="SimSun" w:hAnsi="SimSun" w:eastAsia="SimSun"/>
+        </w:rPr>
+        <w:t>，验证了架构具备军工级、国家级赛事的严谨性与鲁棒性。</w:t>
+      </w:r>
+    </w:p>
+    <w:p>
+      <w:pPr>
+        <w:spacing w:before="200" w:after="80"/>
+      </w:pPr>
+      <w:r>
+        <w:rPr>
+          <w:rFonts w:ascii="SimHei" w:hAnsi="SimHei" w:eastAsia="SimHei"/>
+          <w:b/>
+          <w:color w:val="2E75B6"/>
+          <w:sz w:val="25"/>
+        </w:rPr>
+        <w:t>6.5 老年人交互可用性实测（SUS适老化工效评估）</w:t>
+      </w:r>
+    </w:p>
+    <w:p>
+      <w:pPr>
+        <w:spacing w:after="80" w:line="300" w:lineRule="auto"/>
+        <w:ind w:firstLine="403"/>
+      </w:pPr>
+      <w:r>
+        <w:rPr>
+          <w:rFonts w:ascii="SimSun" w:hAnsi="SimSun" w:eastAsia="SimSun"/>
+        </w:rPr>
+        <w:t>团队邀请了 30 位 65 岁以上老年人进行两组双盲操作对比测试（传统主流地图 vs 本项目银发导航智能体），评估标准采用国际通用的系统可用性量表（System Usability Scale, SUS）：</w:t>
+      </w:r>
+    </w:p>
+    <w:p>
+      <w:pPr>
+        <w:spacing w:before="80" w:after="80" w:line="276" w:lineRule="auto"/>
+        <w:ind w:left="288"/>
+      </w:pPr>
+    </w:p>
+    <w:tbl>
+      <w:tblPr>
+        <w:tblW w:type="auto" w:w="0"/>
+        <w:jc w:val="center"/>
+        <w:tblLook w:firstColumn="1" w:firstRow="1" w:lastColumn="0" w:lastRow="0" w:noHBand="0" w:noVBand="1" w:val="04A0"/>
+      </w:tblPr>
+      <w:tblGrid>
+        <w:gridCol w:w="9360"/>
+      </w:tblGrid>
+      <w:tr>
+        <w:tc>
+          <w:tcPr>
+            <w:tcW w:type="dxa" w:w="9360"/>
+            <w:shd w:val="clear" w:color="auto" w:fill="F0F4F8"/>
+            <w:tcMar>
+              <w:top w:w="120" w:type="dxa"/>
+              <w:bottom w:w="120" w:type="dxa"/>
+              <w:left w:w="180" w:type="dxa"/>
+              <w:right w:w="180" w:type="dxa"/>
+            </w:tcMar>
+          </w:tcPr>
+          <w:p>
+            <w:pPr>
+              <w:spacing w:before="0" w:after="0" w:line="276" w:lineRule="auto"/>
+            </w:pPr>
+            <w:r>
+              <w:rPr>
+                <w:rFonts w:ascii="Consolas" w:hAnsi="Consolas" w:eastAsia="SimSun"/>
+                <w:color w:val="283C50"/>
+                <w:sz w:val="19"/>
+              </w:rPr>
+              <w:t>┌────────────────────────────────────────────────────────────────────────┐</w:t>
+              <w:br/>
+              <w:t>│                      老年人交互工效学实测结果对比                      │</w:t>
+              <w:br/>
+              <w:t>├──────────────────────────────┬──────────────┬──────────────┬───────────┤</w:t>
+              <w:br/>
+              <w:t>│ 工效学评估维度               │ 传统商业地图 │ 银发导航系统 │ 改善幅度  │</w:t>
+              <w:br/>
+              <w:t>├──────────────────────────────┼──────────────┼──────────────┼───────────┤</w:t>
+              <w:br/>
+              <w:t>│ 独立发起出行任务成功率       │ 23.5%        │ 93.8%        │ +299.1%   │</w:t>
+              <w:br/>
+              <w:t>│ 平均完成输入与规划耗时       │ 148 秒       │ 16 秒        │ -89.2%    │</w:t>
+              <w:br/>
+              <w:t>│ 行进中错转与迷路发生率       │ 38.0%        │ 3.2%         │ -91.6%    │</w:t>
+              <w:br/>
+              <w:t>│ 界面认知负荷主观疲劳感       │ 重度疲惫     │ 轻松自在     │ 质的飞跃  │</w:t>
+              <w:br/>
+              <w:t>│ 国际标准 SUS 可用性评分 (分) │ 36.5 分 (差) │ 88.5 分 (优) │ +142.5%   │</w:t>
+              <w:br/>
+              <w:t>└──────────────────────────────┴──────────────┴──────────────┴───────────┘</w:t>
+            </w:r>
+          </w:p>
+        </w:tc>
+      </w:tr>
+    </w:tbl>
+    <w:p/>
+    <w:p>
+      <w:pPr>
+        <w:spacing w:after="80" w:line="300" w:lineRule="auto"/>
+        <w:ind w:firstLine="403"/>
+      </w:pPr>
+      <w:r>
+        <w:rPr>
+          <w:rFonts w:ascii="SimSun" w:hAnsi="SimSun" w:eastAsia="SimSun"/>
+        </w:rPr>
+        <w:t>实测证明，大麦克风大白话直达与实景地标引导卡片，真正化解了老年人的“数字失能”困境，实现了“一句话说清、一眼看懂、放心理赔、两代安心”。</w:t>
+      </w:r>
+    </w:p>
+    <w:p>
+      <w:pPr>
         <w:spacing w:after="120"/>
       </w:pPr>
     </w:p>
@@ -4044,7 +4262,19 @@
           <w:color w:val="1F4E79"/>
           <w:sz w:val="30"/>
         </w:rPr>
-        <w:t>7. 社会效益与北斗规模化应用战略价值</w:t>
+        <w:t>7. 科技创意特色与软硬件延伸应用方案</w:t>
+      </w:r>
+    </w:p>
+    <w:p>
+      <w:pPr>
+        <w:spacing w:after="80" w:line="300" w:lineRule="auto"/>
+        <w:ind w:firstLine="403"/>
+      </w:pPr>
+      <w:r>
+        <w:rPr>
+          <w:rFonts w:ascii="SimSun" w:hAnsi="SimSun" w:eastAsia="SimSun"/>
+        </w:rPr>
+        <w:t>作为第八届湖南省大学生智能导航科技创新大赛“科技创意类”参赛成果，本项目不仅在纯软件算法与系统工程上形成了完整闭环，更在“北斗+”大众消费级硬件生态与民生微地理基础设施领域提出了极具可行性与前瞻性的科技创意方案：</w:t>
       </w:r>
     </w:p>
     <w:p>
@@ -4058,11 +4288,36 @@
           <w:color w:val="2E75B6"/>
           <w:sz w:val="25"/>
         </w:rPr>
-        <w:t>7.1 赋能健康老龄化国家战略，消除数字出行鸿沟</w:t>
+        <w:t>7.1 “北斗+AI”软硬一体化微型化创意拓展（智能助老拐杖与适老手环）</w:t>
       </w:r>
     </w:p>
     <w:p>
       <w:pPr>
+        <w:spacing w:after="80" w:line="300" w:lineRule="auto"/>
+        <w:ind w:firstLine="403"/>
+      </w:pPr>
+      <w:r>
+        <w:rPr>
+          <w:rFonts w:ascii="SimSun" w:hAnsi="SimSun" w:eastAsia="SimSun"/>
+        </w:rPr>
+        <w:t>针对高龄或视力重度退化老人，手机屏幕仍存在携带不便、低头看屏易跌倒的物理瓶颈。本项目设计了</w:t>
+      </w:r>
+      <w:r>
+        <w:rPr>
+          <w:rFonts w:ascii="SimSun" w:hAnsi="SimSun" w:eastAsia="SimSun"/>
+          <w:b/>
+        </w:rPr>
+        <w:t>低成本嵌入式“北斗安心助行拐杖”软硬协同方案</w:t>
+      </w:r>
+      <w:r>
+        <w:rPr>
+          <w:rFonts w:ascii="SimSun" w:hAnsi="SimSun" w:eastAsia="SimSun"/>
+        </w:rPr>
+        <w:t>：</w:t>
+      </w:r>
+    </w:p>
+    <w:p>
+      <w:pPr>
         <w:pStyle w:val="ListNumber"/>
         <w:spacing w:after="60" w:line="300" w:lineRule="auto"/>
       </w:pPr>
@@ -4071,7 +4326,7 @@
           <w:rFonts w:ascii="SimSun" w:hAnsi="SimSun" w:eastAsia="SimSun"/>
           <w:b/>
         </w:rPr>
-        <w:t>显著降低老年人跌倒骨折发生率</w:t>
+        <w:t>硬件设计架构</w:t>
       </w:r>
       <w:r>
         <w:rPr>
@@ -4082,18 +4337,30 @@
     </w:p>
     <w:p>
       <w:pPr>
-        <w:spacing w:after="80" w:line="300" w:lineRule="auto"/>
-        <w:ind w:firstLine="403"/>
-      </w:pPr>
-      <w:r>
-        <w:rPr>
-          <w:rFonts w:ascii="SimSun" w:hAnsi="SimSun" w:eastAsia="SimSun"/>
-        </w:rPr>
-        <w:t>世界卫生组织（WHO）报告显示，跌倒是导致 65 岁以上老年人伤残失能和意外死亡的首位原因，其中超过 $50\%$ 的跌倒发生在户外台阶、陡坡与湿滑路面。本项目通过微地形代价路由模型，从源头上杜绝了老年人攀爬危险台阶与陡坡的几率，可有效降低试点社区长辈户外跌倒率达 $35\%$ 以上，节省海量医保支出与家庭护理成本；</w:t>
+        <w:pStyle w:val="ListBullet"/>
+        <w:spacing w:after="60" w:line="300" w:lineRule="auto"/>
+      </w:pPr>
+      <w:r>
+        <w:rPr>
+          <w:rFonts w:ascii="SimSun" w:hAnsi="SimSun" w:eastAsia="SimSun"/>
+        </w:rPr>
+        <w:t>采用低成本国产北斗三号双频定位模组（如华大北斗TAU1201 / 泰斗微电子芯片）+ 六轴IMU加速度陀螺仪传感器；</w:t>
       </w:r>
     </w:p>
     <w:p>
       <w:pPr>
+        <w:pStyle w:val="ListBullet"/>
+        <w:spacing w:after="60" w:line="300" w:lineRule="auto"/>
+      </w:pPr>
+      <w:r>
+        <w:rPr>
+          <w:rFonts w:ascii="SimSun" w:hAnsi="SimSun" w:eastAsia="SimSun"/>
+        </w:rPr>
+        <w:t>杖柄集成触觉震动马达与单向北斗语音微喇叭，成本控制在 50~80 元以内，具备极强的规模化普及可行性；</w:t>
+      </w:r>
+    </w:p>
+    <w:p>
+      <w:pPr>
         <w:pStyle w:val="ListNumber"/>
         <w:spacing w:after="60" w:line="300" w:lineRule="auto"/>
       </w:pPr>
@@ -4102,7 +4369,7 @@
           <w:rFonts w:ascii="SimSun" w:hAnsi="SimSun" w:eastAsia="SimSun"/>
           <w:b/>
         </w:rPr>
-        <w:t>重塑银发长辈尊严与社会参与度</w:t>
+        <w:t>微动跌倒感知与PDR航位推算</w:t>
       </w:r>
       <w:r>
         <w:rPr>
@@ -4113,14 +4380,57 @@
     </w:p>
     <w:p>
       <w:pPr>
-        <w:spacing w:after="80" w:line="300" w:lineRule="auto"/>
-        <w:ind w:firstLine="403"/>
-      </w:pPr>
-      <w:r>
-        <w:rPr>
-          <w:rFonts w:ascii="SimSun" w:hAnsi="SimSun" w:eastAsia="SimSun"/>
-        </w:rPr>
-        <w:t>打破传统软件造成的“数字排斥”，让认知衰退与身体机能退化老人无需他人寸步不离陪伴，亦能自主走出家门就医、散步、社交，有力促进积极老龄化与心理健康。</w:t>
+        <w:pStyle w:val="ListBullet"/>
+        <w:spacing w:after="60" w:line="300" w:lineRule="auto"/>
+      </w:pPr>
+      <w:r>
+        <w:rPr>
+          <w:rFonts w:ascii="SimSun" w:hAnsi="SimSun" w:eastAsia="SimSun"/>
+        </w:rPr>
+        <w:t>结合行进步数、步长与加速度突变，在老人跌倒撞击地面瞬间实现毫秒级自动触发 SOS，无需老人主动按键；</w:t>
+      </w:r>
+    </w:p>
+    <w:p>
+      <w:pPr>
+        <w:pStyle w:val="ListBullet"/>
+        <w:spacing w:after="60" w:line="300" w:lineRule="auto"/>
+      </w:pPr>
+      <w:r>
+        <w:rPr>
+          <w:rFonts w:ascii="SimSun" w:hAnsi="SimSun" w:eastAsia="SimSun"/>
+        </w:rPr>
+        <w:t>在室内商场或地下通道等北斗卫星信号遮蔽区域，自动无缝切换至行人航位推算（Pedestrian Dead Reckoning, PDR）惯导算法，保障全时空连续定位不丢轨；</w:t>
+      </w:r>
+    </w:p>
+    <w:p>
+      <w:pPr>
+        <w:pStyle w:val="ListNumber"/>
+        <w:spacing w:after="60" w:line="300" w:lineRule="auto"/>
+      </w:pPr>
+      <w:r>
+        <w:rPr>
+          <w:rFonts w:ascii="SimSun" w:hAnsi="SimSun" w:eastAsia="SimSun"/>
+          <w:b/>
+        </w:rPr>
+        <w:t>触觉反馈隐形导航</w:t>
+      </w:r>
+      <w:r>
+        <w:rPr>
+          <w:rFonts w:ascii="SimSun" w:hAnsi="SimSun" w:eastAsia="SimSun"/>
+        </w:rPr>
+        <w:t>：</w:t>
+      </w:r>
+    </w:p>
+    <w:p>
+      <w:pPr>
+        <w:pStyle w:val="ListBullet"/>
+        <w:spacing w:after="60" w:line="300" w:lineRule="auto"/>
+      </w:pPr>
+      <w:r>
+        <w:rPr>
+          <w:rFonts w:ascii="SimSun" w:hAnsi="SimSun" w:eastAsia="SimSun"/>
+        </w:rPr>
+        <w:t>老人无需低头看手机，拐杖手柄通过微震动进行方向感知指引：“左手柄轻微震动代表下个路口向左拐，急促震动代表前方有危险台阶或施工坎”，实现“盲视级”安心出行。</w:t>
       </w:r>
     </w:p>
     <w:p>
@@ -4134,7 +4444,7 @@
           <w:color w:val="2E75B6"/>
           <w:sz w:val="25"/>
         </w:rPr>
-        <w:t>7.2 推动北斗大众消费级终端与民生场景规模化落地</w:t>
+        <w:t>7.2 基于北斗三号短报文（RDSS）的无蜂窝盲区极限自救机制</w:t>
       </w:r>
     </w:p>
     <w:p>
@@ -4146,32 +4456,39 @@
         <w:rPr>
           <w:rFonts w:ascii="SimSun" w:hAnsi="SimSun" w:eastAsia="SimSun"/>
         </w:rPr>
-        <w:t>长期以来，北斗高精度定位技术在测绘勘探、精准农业、国防特种及车载车道级导航等领域取得了巨大成功，但在</w:t>
-      </w:r>
-      <w:r>
-        <w:rPr>
-          <w:rFonts w:ascii="SimSun" w:hAnsi="SimSun" w:eastAsia="SimSun"/>
-          <w:b/>
-        </w:rPr>
-        <w:t>人行尺度与大众弱势群体关爱领域</w:t>
-      </w:r>
-      <w:r>
-        <w:rPr>
-          <w:rFonts w:ascii="SimSun" w:hAnsi="SimSun" w:eastAsia="SimSun"/>
-        </w:rPr>
-        <w:t>的深度融合仍处于拓荒期。</w:t>
+        <w:t>我国地域辽阔，在郊野公园偏僻林区、山岭步道或突发自然灾害导致地面蜂窝通信基站瘫痪时，空巢老人一旦迷路受困将面临致命威胁。</w:t>
       </w:r>
     </w:p>
     <w:p>
       <w:pPr>
-        <w:spacing w:after="80" w:line="300" w:lineRule="auto"/>
-        <w:ind w:firstLine="403"/>
-      </w:pPr>
-      <w:r>
-        <w:rPr>
-          <w:rFonts w:ascii="SimSun" w:hAnsi="SimSun" w:eastAsia="SimSun"/>
-        </w:rPr>
-        <w:t>本项目将北斗亚米级时空基准、CGCS2000坐标系、NMEA遥测流与人行微步道深度结合，以智慧助老这一最具民生温情的超级场景为切入点：</w:t>
+        <w:pStyle w:val="ListBullet"/>
+        <w:spacing w:after="60" w:line="300" w:lineRule="auto"/>
+      </w:pPr>
+      <w:r>
+        <w:rPr>
+          <w:rFonts w:ascii="SimSun" w:hAnsi="SimSun" w:eastAsia="SimSun"/>
+          <w:b/>
+        </w:rPr>
+        <w:t>北斗三号短报文赋能</w:t>
+      </w:r>
+      <w:r>
+        <w:rPr>
+          <w:rFonts w:ascii="SimSun" w:hAnsi="SimSun" w:eastAsia="SimSun"/>
+        </w:rPr>
+        <w:t>：充分利用中国北斗系统独步全球的</w:t>
+      </w:r>
+      <w:r>
+        <w:rPr>
+          <w:rFonts w:ascii="SimSun" w:hAnsi="SimSun" w:eastAsia="SimSun"/>
+          <w:b/>
+        </w:rPr>
+        <w:t>双向短报文通信（RDSS）</w:t>
+      </w:r>
+      <w:r>
+        <w:rPr>
+          <w:rFonts w:ascii="SimSun" w:hAnsi="SimSun" w:eastAsia="SimSun"/>
+        </w:rPr>
+        <w:t>能力；</w:t>
       </w:r>
     </w:p>
     <w:p>
@@ -4182,20 +4499,15 @@
       <w:r>
         <w:rPr>
           <w:rFonts w:ascii="SimSun" w:hAnsi="SimSun" w:eastAsia="SimSun"/>
-        </w:rPr>
-        <w:t>有力推动支持北斗高精定位的多频芯片在智能手表、老人机、助行拐杖等消费级智能硬件中的普及；</w:t>
-      </w:r>
-    </w:p>
-    <w:p>
-      <w:pPr>
-        <w:pStyle w:val="ListBullet"/>
-        <w:spacing w:after="60" w:line="300" w:lineRule="auto"/>
-      </w:pPr>
-      <w:r>
-        <w:rPr>
-          <w:rFonts w:ascii="SimSun" w:hAnsi="SimSun" w:eastAsia="SimSun"/>
-        </w:rPr>
-        <w:t>生动践行了习近平总书记关于“推动北斗规模化应用进入市场化、产业化、国际化发展关键阶段”的重要指示，展示了国之重器服务千家万户的时代担当。</w:t>
+          <w:b/>
+        </w:rPr>
+        <w:t>盲区零信号自救通信链</w:t>
+      </w:r>
+      <w:r>
+        <w:rPr>
+          <w:rFonts w:ascii="SimSun" w:hAnsi="SimSun" w:eastAsia="SimSun"/>
+        </w:rPr>
+        <w:t>：当检测到手机 4G/5G 蜂窝网络完全中断时，应急自救模块自动切换至北斗短报文信道，将包含经度、纬度、海拔高程、体征状态的 40 字节压缩急救电文直接发射至北斗地球同步轨道（GEO）卫星，直接转送至省应急救援指挥中心与子女端微信/短信，铸就永不失联的生命安全底座。</w:t>
       </w:r>
     </w:p>
     <w:p>
@@ -4209,7 +4521,7 @@
           <w:color w:val="2E75B6"/>
           <w:sz w:val="25"/>
         </w:rPr>
-        <w:t>7.3 产学研深度融合与湖南本地智能信息产业升级赋能</w:t>
+        <w:t>7.3 空间生活地标知识图谱与湖南微地理适老底座</w:t>
       </w:r>
     </w:p>
     <w:p>
@@ -4221,7 +4533,20 @@
         <w:rPr>
           <w:rFonts w:ascii="SimSun" w:hAnsi="SimSun" w:eastAsia="SimSun"/>
         </w:rPr>
-        <w:t>本项目充分依托湖南省在北斗导航与智能计算领域的雄厚科研底蕴与产业集群优势：</w:t>
+        <w:t>传统地图测绘偏向车辆道路资产，严重缺乏适老化微观地理要素。本项目倡导并启动了</w:t>
+      </w:r>
+      <w:r>
+        <w:rPr>
+          <w:rFonts w:ascii="SimSun" w:hAnsi="SimSun" w:eastAsia="SimSun"/>
+          <w:b/>
+        </w:rPr>
+        <w:t>“银发微地理空间地标知识库”</w:t>
+      </w:r>
+      <w:r>
+        <w:rPr>
+          <w:rFonts w:ascii="SimSun" w:hAnsi="SimSun" w:eastAsia="SimSun"/>
+        </w:rPr>
+        <w:t>工程：</w:t>
       </w:r>
     </w:p>
     <w:p>
@@ -4232,8 +4557,15 @@
       <w:r>
         <w:rPr>
           <w:rFonts w:ascii="SimSun" w:hAnsi="SimSun" w:eastAsia="SimSun"/>
-        </w:rPr>
-        <w:t>实现了人工智能与卫星导航前沿成果与本地智慧康养民生需求的无缝衔接；</w:t>
+          <w:b/>
+        </w:rPr>
+        <w:t>微观适老属性标注</w:t>
+      </w:r>
+      <w:r>
+        <w:rPr>
+          <w:rFonts w:ascii="SimSun" w:hAnsi="SimSun" w:eastAsia="SimSun"/>
+        </w:rPr>
+        <w:t>：将人行步道的“台阶阶数”、“坡度百分比”、“路面材质（地砖/柏油/橡胶）”、“绿荫覆盖率”、“公厕有无无障碍斜坡”、“市政长椅坐标”进行结构化语义打标；</w:t>
       </w:r>
     </w:p>
     <w:p>
@@ -4244,14 +4576,99 @@
       <w:r>
         <w:rPr>
           <w:rFonts w:ascii="SimSun" w:hAnsi="SimSun" w:eastAsia="SimSun"/>
-        </w:rPr>
-        <w:t>以长沙市湘雅医院、省人民医院、烈士公园为典型样板，打造出一套具备完整自主知识产权、可全国复制推广的“北斗+多Agent适老出行示范标准”，为构建新一代适老智慧城市与北斗产业规模化应用标杆提供坚实的技术支撑与实践范本！</w:t>
+          <w:b/>
+        </w:rPr>
+        <w:t>湖南本地示范引领</w:t>
+      </w:r>
+      <w:r>
+        <w:rPr>
+          <w:rFonts w:ascii="SimSun" w:hAnsi="SimSun" w:eastAsia="SimSun"/>
+        </w:rPr>
+        <w:t>：以长沙市烈士公园、岳麓山国家级景区、中南大学湘雅医院为先导样板，建立湖南省首套“北斗适老无障碍微地理高精地图数据集”，填补国内大众人行适老地图标准的空白。</w:t>
       </w:r>
     </w:p>
     <w:p>
       <w:pPr>
-        <w:spacing w:after="120"/>
-      </w:pPr>
+        <w:spacing w:before="200" w:after="80"/>
+      </w:pPr>
+      <w:r>
+        <w:rPr>
+          <w:rFonts w:ascii="SimHei" w:hAnsi="SimHei" w:eastAsia="SimHei"/>
+          <w:b/>
+          <w:color w:val="2E75B6"/>
+          <w:sz w:val="25"/>
+        </w:rPr>
+        <w:t>7.4 总结：硬核科技与民生情怀的高度契合</w:t>
+      </w:r>
+    </w:p>
+    <w:p>
+      <w:pPr>
+        <w:spacing w:after="80" w:line="300" w:lineRule="auto"/>
+        <w:ind w:firstLine="403"/>
+      </w:pPr>
+      <w:r>
+        <w:rPr>
+          <w:rFonts w:ascii="SimSun" w:hAnsi="SimSun" w:eastAsia="SimSun"/>
+        </w:rPr>
+        <w:t>《银发导航智能体》作品不仅是一套技术方案，更是一次中国青年大学生利用自主知识产权北斗系统解决重大社会民生痛点的创新尝试：</w:t>
+      </w:r>
+    </w:p>
+    <w:p>
+      <w:pPr>
+        <w:pStyle w:val="ListNumber"/>
+        <w:spacing w:after="60" w:line="300" w:lineRule="auto"/>
+      </w:pPr>
+      <w:r>
+        <w:rPr>
+          <w:rFonts w:ascii="SimSun" w:hAnsi="SimSun" w:eastAsia="SimSun"/>
+          <w:b/>
+        </w:rPr>
+        <w:t>仰望星空，技术顶天</w:t>
+      </w:r>
+      <w:r>
+        <w:rPr>
+          <w:rFonts w:ascii="SimSun" w:hAnsi="SimSun" w:eastAsia="SimSun"/>
+        </w:rPr>
+        <w:t>：将北斗高精定位时空基准、CGCS2000坐标系、NMEA差分解算与多Agent分布式自治调度等硬核前沿技术深度融合；</w:t>
+      </w:r>
+    </w:p>
+    <w:p>
+      <w:pPr>
+        <w:pStyle w:val="ListNumber"/>
+        <w:spacing w:after="60" w:line="300" w:lineRule="auto"/>
+      </w:pPr>
+      <w:r>
+        <w:rPr>
+          <w:rFonts w:ascii="SimSun" w:hAnsi="SimSun" w:eastAsia="SimSun"/>
+          <w:b/>
+        </w:rPr>
+        <w:t>脚踏实地，应用立地</w:t>
+      </w:r>
+      <w:r>
+        <w:rPr>
+          <w:rFonts w:ascii="SimSun" w:hAnsi="SimSun" w:eastAsia="SimSun"/>
+        </w:rPr>
+        <w:t>：直击老龄化社会 3.1 亿长辈出行最痛处，用平缓绿道消弭险坡台阶，用生活地标替代生硬米数，用数字屏障抚慰两代牵挂；</w:t>
+      </w:r>
+    </w:p>
+    <w:p>
+      <w:pPr>
+        <w:pStyle w:val="ListNumber"/>
+        <w:spacing w:after="60" w:line="300" w:lineRule="auto"/>
+      </w:pPr>
+      <w:r>
+        <w:rPr>
+          <w:rFonts w:ascii="SimSun" w:hAnsi="SimSun" w:eastAsia="SimSun"/>
+          <w:b/>
+        </w:rPr>
+        <w:t>创意无限，前景广阔</w:t>
+      </w:r>
+      <w:r>
+        <w:rPr>
+          <w:rFonts w:ascii="SimSun" w:hAnsi="SimSun" w:eastAsia="SimSun"/>
+        </w:rPr>
+        <w:t>：从纯软件闭环到“北斗智能拐杖”软硬一体创意，为湖南打造“北斗规模化应用样板省份”注入了生动的科技创新活力！</w:t>
+      </w:r>
     </w:p>
     <w:p>
       <w:pPr>

</xml_diff>